<commit_message>
docs: SSIP submission - fund requirement raised to Rs 3,00,000 with revised breakup, references now include links
</commit_message>
<xml_diff>
--- a/docs/NearKart_SSIP_Idea_Submission.docx
+++ b/docs/NearKart_SSIP_Idea_Submission.docx
@@ -681,7 +681,7 @@
           </w:tcPr>
           <w:p>
             <w:r>
-              <w:t>1.00.000 INR</w:t>
+              <w:t>3.00.000 INR</w:t>
             </w:r>
           </w:p>
         </w:tc>
@@ -716,7 +716,7 @@
               <w:ind w:left="245" w:hanging="245"/>
             </w:pPr>
             <w:r>
-              <w:t>Software / Cloud services (Vercel Pro, maps &amp; payment API credits):</w:t>
+              <w:t>Software / Cloud services (Vercel Pro, Google Maps &amp; payment gateway API credits, AI/R&amp;D infrastructure):</w:t>
             </w:r>
           </w:p>
         </w:tc>
@@ -726,7 +726,7 @@
           </w:tcPr>
           <w:p>
             <w:r>
-              <w:t>30,000</w:t>
+              <w:t>60,000</w:t>
             </w:r>
           </w:p>
         </w:tc>
@@ -766,7 +766,7 @@
           </w:tcPr>
           <w:p>
             <w:r>
-              <w:t>5,000</w:t>
+              <w:t>20,000</w:t>
             </w:r>
           </w:p>
         </w:tc>
@@ -806,7 +806,7 @@
           </w:tcPr>
           <w:p>
             <w:r>
-              <w:t>5,000</w:t>
+              <w:t>20,000</w:t>
             </w:r>
           </w:p>
         </w:tc>
@@ -846,7 +846,7 @@
           </w:tcPr>
           <w:p>
             <w:r>
-              <w:t>25,000</w:t>
+              <w:t>80,000</w:t>
             </w:r>
           </w:p>
         </w:tc>
@@ -886,7 +886,7 @@
           </w:tcPr>
           <w:p>
             <w:r>
-              <w:t>10,000</w:t>
+              <w:t>30,000</w:t>
             </w:r>
           </w:p>
         </w:tc>
@@ -926,7 +926,7 @@
           </w:tcPr>
           <w:p>
             <w:r>
-              <w:t>15,000</w:t>
+              <w:t>40,000</w:t>
             </w:r>
           </w:p>
         </w:tc>
@@ -966,7 +966,7 @@
           </w:tcPr>
           <w:p>
             <w:r>
-              <w:t>10,000</w:t>
+              <w:t>50,000</w:t>
             </w:r>
           </w:p>
         </w:tc>
@@ -990,16 +990,16 @@
           <w:p>
             <w:r>
               <w:t>1. RedSeer Consulting – India Quick Commerce Market Report (quick commerce projected to reach US$30–40B by 2030)</w:t>
-            </w:r>
-          </w:p>
-          <w:p>
-            <w:r>
+              <w:br/>
+              <w:t>https://www.redseer.com/newsletters/quick-commerce-in-india</w:t>
+              <w:br/>
               <w:t>2. IBEF – Indian Retail Industry Report (kirana share of Indian FMCG retail)</w:t>
-            </w:r>
-          </w:p>
-          <w:p>
-            <w:r>
+              <w:br/>
+              <w:t>https://www.ibef.org/industry/retail-india-presentation</w:t>
+              <w:br/>
               <w:t>3. Economic Times Retail – coverage of dark-store expansion and unit economics of quick commerce in India</w:t>
+              <w:br/>
+              <w:t>https://retail.economictimes.indiatimes.com/</w:t>
             </w:r>
           </w:p>
         </w:tc>

</xml_diff>